<commit_message>
Finalized manuscript and submission materials for Journal of Computational Science
</commit_message>
<xml_diff>
--- a/01_Research_Papers/Static_Relativistic_Potential/06_Paper_Draft/Cover_Letter.docx
+++ b/01_Research_Papers/Static_Relativistic_Potential/06_Paper_Draft/Cover_Letter.docx
@@ -4,102 +4,364 @@
   <w:body>
     <w:p>
       <w:pPr>
-        <w:pStyle w:val="NormalWeb"/>
+        <w:spacing w:before="100" w:beforeAutospacing="1" w:after="100" w:afterAutospacing="1" w:line="240" w:lineRule="auto"/>
+        <w:rPr>
+          <w:rFonts w:ascii="Times New Roman" w:eastAsia="Times New Roman" w:hAnsi="Times New Roman" w:cs="Times New Roman"/>
+          <w:kern w:val="0"/>
+          <w:sz w:val="24"/>
+          <w:szCs w:val="24"/>
+          <w:lang w:eastAsia="en-IN"/>
+          <w14:ligatures w14:val="none"/>
+        </w:rPr>
       </w:pPr>
       <w:r>
+        <w:rPr>
+          <w:rFonts w:ascii="Times New Roman" w:eastAsia="Times New Roman" w:hAnsi="Times New Roman" w:cs="Times New Roman"/>
+          <w:b/>
+          <w:bCs/>
+          <w:kern w:val="0"/>
+          <w:sz w:val="24"/>
+          <w:szCs w:val="24"/>
+          <w:lang w:eastAsia="en-IN"/>
+          <w14:ligatures w14:val="none"/>
+        </w:rPr>
         <w:t>Dear Editor,</w:t>
       </w:r>
     </w:p>
     <w:p>
       <w:pPr>
-        <w:pStyle w:val="NormalWeb"/>
+        <w:spacing w:before="100" w:beforeAutospacing="1" w:after="100" w:afterAutospacing="1" w:line="240" w:lineRule="auto"/>
+        <w:rPr>
+          <w:rFonts w:ascii="Times New Roman" w:eastAsia="Times New Roman" w:hAnsi="Times New Roman" w:cs="Times New Roman"/>
+          <w:kern w:val="0"/>
+          <w:sz w:val="24"/>
+          <w:szCs w:val="24"/>
+          <w:lang w:eastAsia="en-IN"/>
+          <w14:ligatures w14:val="none"/>
+        </w:rPr>
       </w:pPr>
       <w:r>
+        <w:rPr>
+          <w:rFonts w:ascii="Times New Roman" w:eastAsia="Times New Roman" w:hAnsi="Times New Roman" w:cs="Times New Roman"/>
+          <w:kern w:val="0"/>
+          <w:sz w:val="24"/>
+          <w:szCs w:val="24"/>
+          <w:lang w:eastAsia="en-IN"/>
+          <w14:ligatures w14:val="none"/>
+        </w:rPr>
         <w:t>Please consider my manuscript entitled:</w:t>
       </w:r>
     </w:p>
     <w:p>
       <w:pPr>
-        <w:pStyle w:val="NormalWeb"/>
+        <w:spacing w:before="100" w:beforeAutospacing="1" w:after="100" w:afterAutospacing="1" w:line="240" w:lineRule="auto"/>
+        <w:rPr>
+          <w:rFonts w:ascii="Times New Roman" w:eastAsia="Times New Roman" w:hAnsi="Times New Roman" w:cs="Times New Roman"/>
+          <w:kern w:val="0"/>
+          <w:sz w:val="24"/>
+          <w:szCs w:val="24"/>
+          <w:lang w:eastAsia="en-IN"/>
+          <w14:ligatures w14:val="none"/>
+        </w:rPr>
       </w:pPr>
       <w:r>
+        <w:rPr>
+          <w:rFonts w:ascii="Times New Roman" w:eastAsia="Times New Roman" w:hAnsi="Times New Roman" w:cs="Times New Roman"/>
+          <w:b/>
+          <w:bCs/>
+          <w:kern w:val="0"/>
+          <w:sz w:val="24"/>
+          <w:szCs w:val="24"/>
+          <w:lang w:eastAsia="en-IN"/>
+          <w14:ligatures w14:val="none"/>
+        </w:rPr>
         <w:t>"Machine Learning Assisted Analysis of a Static Relativistic Gravitational Potential: A Comparative Study with Newtonian Approximation and Error Quantification"</w:t>
       </w:r>
     </w:p>
     <w:p>
       <w:pPr>
-        <w:pStyle w:val="NormalWeb"/>
+        <w:spacing w:before="100" w:beforeAutospacing="1" w:after="100" w:afterAutospacing="1" w:line="240" w:lineRule="auto"/>
+        <w:rPr>
+          <w:rFonts w:ascii="Times New Roman" w:eastAsia="Times New Roman" w:hAnsi="Times New Roman" w:cs="Times New Roman"/>
+          <w:kern w:val="0"/>
+          <w:sz w:val="24"/>
+          <w:szCs w:val="24"/>
+          <w:lang w:eastAsia="en-IN"/>
+          <w14:ligatures w14:val="none"/>
+        </w:rPr>
       </w:pPr>
       <w:r>
-        <w:t>for publication as a Research Article in the European Journal of Physics.</w:t>
+        <w:rPr>
+          <w:rFonts w:ascii="Times New Roman" w:eastAsia="Times New Roman" w:hAnsi="Times New Roman" w:cs="Times New Roman"/>
+          <w:kern w:val="0"/>
+          <w:sz w:val="24"/>
+          <w:szCs w:val="24"/>
+          <w:lang w:eastAsia="en-IN"/>
+          <w14:ligatures w14:val="none"/>
+        </w:rPr>
+        <w:t xml:space="preserve">for publication as a </w:t>
+      </w:r>
+      <w:r>
+        <w:rPr>
+          <w:rFonts w:ascii="Times New Roman" w:eastAsia="Times New Roman" w:hAnsi="Times New Roman" w:cs="Times New Roman"/>
+          <w:b/>
+          <w:bCs/>
+          <w:kern w:val="0"/>
+          <w:sz w:val="24"/>
+          <w:szCs w:val="24"/>
+          <w:lang w:eastAsia="en-IN"/>
+          <w14:ligatures w14:val="none"/>
+        </w:rPr>
+        <w:t>Full Length Article</w:t>
+      </w:r>
+      <w:r>
+        <w:rPr>
+          <w:rFonts w:ascii="Times New Roman" w:eastAsia="Times New Roman" w:hAnsi="Times New Roman" w:cs="Times New Roman"/>
+          <w:kern w:val="0"/>
+          <w:sz w:val="24"/>
+          <w:szCs w:val="24"/>
+          <w:lang w:eastAsia="en-IN"/>
+          <w14:ligatures w14:val="none"/>
+        </w:rPr>
+        <w:t xml:space="preserve"> in the </w:t>
+      </w:r>
+      <w:r>
+        <w:rPr>
+          <w:rFonts w:ascii="Times New Roman" w:eastAsia="Times New Roman" w:hAnsi="Times New Roman" w:cs="Times New Roman"/>
+          <w:b/>
+          <w:bCs/>
+          <w:kern w:val="0"/>
+          <w:sz w:val="24"/>
+          <w:szCs w:val="24"/>
+          <w:lang w:eastAsia="en-IN"/>
+          <w14:ligatures w14:val="none"/>
+        </w:rPr>
+        <w:t>Journal of Computational Science</w:t>
+      </w:r>
+      <w:r>
+        <w:rPr>
+          <w:rFonts w:ascii="Times New Roman" w:eastAsia="Times New Roman" w:hAnsi="Times New Roman" w:cs="Times New Roman"/>
+          <w:kern w:val="0"/>
+          <w:sz w:val="24"/>
+          <w:szCs w:val="24"/>
+          <w:lang w:eastAsia="en-IN"/>
+          <w14:ligatures w14:val="none"/>
+        </w:rPr>
+        <w:t>.</w:t>
       </w:r>
     </w:p>
     <w:p>
       <w:pPr>
-        <w:pStyle w:val="NormalWeb"/>
+        <w:spacing w:before="100" w:beforeAutospacing="1" w:after="100" w:afterAutospacing="1" w:line="240" w:lineRule="auto"/>
+        <w:rPr>
+          <w:rFonts w:ascii="Times New Roman" w:eastAsia="Times New Roman" w:hAnsi="Times New Roman" w:cs="Times New Roman"/>
+          <w:kern w:val="0"/>
+          <w:sz w:val="24"/>
+          <w:szCs w:val="24"/>
+          <w:lang w:eastAsia="en-IN"/>
+          <w14:ligatures w14:val="none"/>
+        </w:rPr>
       </w:pPr>
       <w:r>
-        <w:t>In this work, I present a computational study of a static relativistic gravitational potential using a machine learning-assisted approach. I compare relativistic predictions with the Newtonian approximation and quantify the regimes where classical approximations remain valid or begin to deviate.</w:t>
+        <w:rPr>
+          <w:rFonts w:ascii="Times New Roman" w:eastAsia="Times New Roman" w:hAnsi="Times New Roman" w:cs="Times New Roman"/>
+          <w:kern w:val="0"/>
+          <w:sz w:val="24"/>
+          <w:szCs w:val="24"/>
+          <w:lang w:eastAsia="en-IN"/>
+          <w14:ligatures w14:val="none"/>
+        </w:rPr>
+        <w:t>In this work, I present a computational framework for analyzing a static relativistic gravitational potential by integrating analytical modeling, numerical error analysis, and machine learning. The study quantitatively compares the relativistic potential with its Newtonian approximation, identifies the limits of the classical approximation through error quantification, and evaluates multiple machine learning algorithms as surrogate models for approximating the underlying physical relationship.</w:t>
       </w:r>
     </w:p>
     <w:p>
       <w:pPr>
-        <w:pStyle w:val="NormalWeb"/>
+        <w:spacing w:before="100" w:beforeAutospacing="1" w:after="100" w:afterAutospacing="1" w:line="240" w:lineRule="auto"/>
+        <w:rPr>
+          <w:rFonts w:ascii="Times New Roman" w:eastAsia="Times New Roman" w:hAnsi="Times New Roman" w:cs="Times New Roman"/>
+          <w:kern w:val="0"/>
+          <w:sz w:val="24"/>
+          <w:szCs w:val="24"/>
+          <w:lang w:eastAsia="en-IN"/>
+          <w14:ligatures w14:val="none"/>
+        </w:rPr>
       </w:pPr>
       <w:r>
-        <w:t>The manuscript combines concepts from gravitational physics, numerical analysis, and scientific machine learning to provide a computational framework for analysing relativistic corrections and approximation errors.</w:t>
+        <w:rPr>
+          <w:rFonts w:ascii="Times New Roman" w:eastAsia="Times New Roman" w:hAnsi="Times New Roman" w:cs="Times New Roman"/>
+          <w:kern w:val="0"/>
+          <w:sz w:val="24"/>
+          <w:szCs w:val="24"/>
+          <w:lang w:eastAsia="en-IN"/>
+          <w14:ligatures w14:val="none"/>
+        </w:rPr>
+        <w:t>The manuscript combines concepts from computational physics, numerical analysis, and scientific machine learning to demonstrate how data-driven methods can complement analytical physical models while preserving physical interpretability. The work aims to contribute to the growing field of computational science by illustrating the integration of modern machine learning techniques with established theoretical physics.</w:t>
       </w:r>
     </w:p>
     <w:p>
       <w:pPr>
-        <w:pStyle w:val="NormalWeb"/>
+        <w:spacing w:before="100" w:beforeAutospacing="1" w:after="100" w:afterAutospacing="1" w:line="240" w:lineRule="auto"/>
+        <w:rPr>
+          <w:rFonts w:ascii="Times New Roman" w:eastAsia="Times New Roman" w:hAnsi="Times New Roman" w:cs="Times New Roman"/>
+          <w:kern w:val="0"/>
+          <w:sz w:val="24"/>
+          <w:szCs w:val="24"/>
+          <w:lang w:eastAsia="en-IN"/>
+          <w14:ligatures w14:val="none"/>
+        </w:rPr>
       </w:pPr>
       <w:r>
-        <w:t>I confirm that this manuscript represents original work, has not been published previously, and is not under consideration by any other journal. I have r</w:t>
-      </w:r>
-      <w:bookmarkStart w:id="0" w:name="_GoBack"/>
-      <w:bookmarkEnd w:id="0"/>
-      <w:r>
-        <w:t>ead and agree to the policies of the journal.</w:t>
+        <w:rPr>
+          <w:rFonts w:ascii="Times New Roman" w:eastAsia="Times New Roman" w:hAnsi="Times New Roman" w:cs="Times New Roman"/>
+          <w:kern w:val="0"/>
+          <w:sz w:val="24"/>
+          <w:szCs w:val="24"/>
+          <w:lang w:eastAsia="en-IN"/>
+          <w14:ligatures w14:val="none"/>
+        </w:rPr>
+        <w:t>I confirm that this manuscript represents original work, has not been published previously, and is not under consideration for publication elsewhere. I have read and agree to the policies of the journal.</w:t>
       </w:r>
     </w:p>
     <w:p>
       <w:pPr>
-        <w:pStyle w:val="NormalWeb"/>
+        <w:spacing w:before="100" w:beforeAutospacing="1" w:after="100" w:afterAutospacing="1" w:line="240" w:lineRule="auto"/>
+        <w:rPr>
+          <w:rFonts w:ascii="Times New Roman" w:eastAsia="Times New Roman" w:hAnsi="Times New Roman" w:cs="Times New Roman"/>
+          <w:kern w:val="0"/>
+          <w:sz w:val="24"/>
+          <w:szCs w:val="24"/>
+          <w:lang w:eastAsia="en-IN"/>
+          <w14:ligatures w14:val="none"/>
+        </w:rPr>
       </w:pPr>
       <w:r>
-        <w:t>I believe this work will be of interest to readers of the European Journal of Physics, particularly those interested in computational approaches to physics modelling and the application of modern computational methods in physics.</w:t>
+        <w:rPr>
+          <w:rFonts w:ascii="Times New Roman" w:eastAsia="Times New Roman" w:hAnsi="Times New Roman" w:cs="Times New Roman"/>
+          <w:kern w:val="0"/>
+          <w:sz w:val="24"/>
+          <w:szCs w:val="24"/>
+          <w:lang w:eastAsia="en-IN"/>
+          <w14:ligatures w14:val="none"/>
+        </w:rPr>
+        <w:t xml:space="preserve">I believe this work will be of interest to the readers of the </w:t>
+      </w:r>
+      <w:r>
+        <w:rPr>
+          <w:rFonts w:ascii="Times New Roman" w:eastAsia="Times New Roman" w:hAnsi="Times New Roman" w:cs="Times New Roman"/>
+          <w:b/>
+          <w:bCs/>
+          <w:kern w:val="0"/>
+          <w:sz w:val="24"/>
+          <w:szCs w:val="24"/>
+          <w:lang w:eastAsia="en-IN"/>
+          <w14:ligatures w14:val="none"/>
+        </w:rPr>
+        <w:t>Journal of Computational Science</w:t>
+      </w:r>
+      <w:r>
+        <w:rPr>
+          <w:rFonts w:ascii="Times New Roman" w:eastAsia="Times New Roman" w:hAnsi="Times New Roman" w:cs="Times New Roman"/>
+          <w:kern w:val="0"/>
+          <w:sz w:val="24"/>
+          <w:szCs w:val="24"/>
+          <w:lang w:eastAsia="en-IN"/>
+          <w14:ligatures w14:val="none"/>
+        </w:rPr>
+        <w:t>, particularly researchers working in computational physics, scientific machine learning, numerical modeling, and computational methods for physical sciences.</w:t>
       </w:r>
     </w:p>
     <w:p>
       <w:pPr>
-        <w:pStyle w:val="NormalWeb"/>
+        <w:spacing w:before="100" w:beforeAutospacing="1" w:after="100" w:afterAutospacing="1" w:line="240" w:lineRule="auto"/>
+        <w:rPr>
+          <w:rFonts w:ascii="Times New Roman" w:eastAsia="Times New Roman" w:hAnsi="Times New Roman" w:cs="Times New Roman"/>
+          <w:kern w:val="0"/>
+          <w:sz w:val="24"/>
+          <w:szCs w:val="24"/>
+          <w:lang w:eastAsia="en-IN"/>
+          <w14:ligatures w14:val="none"/>
+        </w:rPr>
       </w:pPr>
       <w:r>
-        <w:t>Thank you for your consideration.</w:t>
+        <w:rPr>
+          <w:rFonts w:ascii="Times New Roman" w:eastAsia="Times New Roman" w:hAnsi="Times New Roman" w:cs="Times New Roman"/>
+          <w:kern w:val="0"/>
+          <w:sz w:val="24"/>
+          <w:szCs w:val="24"/>
+          <w:lang w:eastAsia="en-IN"/>
+          <w14:ligatures w14:val="none"/>
+        </w:rPr>
+        <w:t>Thank you for your time and consideration. I look forward to your response.</w:t>
       </w:r>
     </w:p>
     <w:p>
       <w:pPr>
-        <w:pStyle w:val="NormalWeb"/>
+        <w:spacing w:before="100" w:beforeAutospacing="1" w:after="100" w:afterAutospacing="1" w:line="240" w:lineRule="auto"/>
+        <w:rPr>
+          <w:rFonts w:ascii="Times New Roman" w:eastAsia="Times New Roman" w:hAnsi="Times New Roman" w:cs="Times New Roman"/>
+          <w:kern w:val="0"/>
+          <w:sz w:val="24"/>
+          <w:szCs w:val="24"/>
+          <w:lang w:eastAsia="en-IN"/>
+          <w14:ligatures w14:val="none"/>
+        </w:rPr>
       </w:pPr>
       <w:r>
+        <w:rPr>
+          <w:rFonts w:ascii="Times New Roman" w:eastAsia="Times New Roman" w:hAnsi="Times New Roman" w:cs="Times New Roman"/>
+          <w:b/>
+          <w:bCs/>
+          <w:kern w:val="0"/>
+          <w:sz w:val="24"/>
+          <w:szCs w:val="24"/>
+          <w:lang w:eastAsia="en-IN"/>
+          <w14:ligatures w14:val="none"/>
+        </w:rPr>
         <w:t>Sincerely,</w:t>
       </w:r>
     </w:p>
     <w:p>
       <w:pPr>
-        <w:pStyle w:val="NormalWeb"/>
+        <w:spacing w:before="100" w:beforeAutospacing="1" w:after="100" w:afterAutospacing="1" w:line="240" w:lineRule="auto"/>
+        <w:rPr>
+          <w:rFonts w:ascii="Times New Roman" w:eastAsia="Times New Roman" w:hAnsi="Times New Roman" w:cs="Times New Roman"/>
+          <w:kern w:val="0"/>
+          <w:sz w:val="24"/>
+          <w:szCs w:val="24"/>
+          <w:lang w:eastAsia="en-IN"/>
+          <w14:ligatures w14:val="none"/>
+        </w:rPr>
       </w:pPr>
       <w:r>
+        <w:rPr>
+          <w:rFonts w:ascii="Times New Roman" w:eastAsia="Times New Roman" w:hAnsi="Times New Roman" w:cs="Times New Roman"/>
+          <w:b/>
+          <w:bCs/>
+          <w:kern w:val="0"/>
+          <w:sz w:val="24"/>
+          <w:szCs w:val="24"/>
+          <w:lang w:eastAsia="en-IN"/>
+          <w14:ligatures w14:val="none"/>
+        </w:rPr>
         <w:t>Aayush Kumar</w:t>
       </w:r>
       <w:r>
+        <w:rPr>
+          <w:rFonts w:ascii="Times New Roman" w:eastAsia="Times New Roman" w:hAnsi="Times New Roman" w:cs="Times New Roman"/>
+          <w:kern w:val="0"/>
+          <w:sz w:val="24"/>
+          <w:szCs w:val="24"/>
+          <w:lang w:eastAsia="en-IN"/>
+          <w14:ligatures w14:val="none"/>
+        </w:rPr>
         <w:br/>
         <w:t>Corresponding Author</w:t>
       </w:r>
     </w:p>
-    <w:p/>
+    <w:p>
+      <w:bookmarkStart w:id="0" w:name="_GoBack"/>
+      <w:bookmarkEnd w:id="0"/>
+    </w:p>
     <w:sectPr>
       <w:pgSz w:w="11906" w:h="16838"/>
       <w:pgMar w:top="1440" w:right="1440" w:bottom="1440" w:left="1440" w:header="708" w:footer="708" w:gutter="0"/>
@@ -556,6 +818,17 @@
       <w14:ligatures w14:val="none"/>
     </w:rPr>
   </w:style>
+  <w:style w:type="character" w:styleId="Strong">
+    <w:name w:val="Strong"/>
+    <w:basedOn w:val="DefaultParagraphFont"/>
+    <w:uiPriority w:val="22"/>
+    <w:qFormat/>
+    <w:rsid w:val="005C348D"/>
+    <w:rPr>
+      <w:b/>
+      <w:bCs/>
+    </w:rPr>
+  </w:style>
 </w:styles>
 </file>
 

</xml_diff>